<commit_message>
proposal: close the six defects found in the read-through
P0.1 two references that were cited but had no entry (SlideGen, PresentBench)
P0.2 the four references that had no citation now carry one: X+Slides
     (audience conditioning), PosterMELD (editable output), PPTBench (layout
     understanding), DeepPresenter (environment-grounded reflection)
P0.3 Table 4 now adds up: weeks counted from 26 Oct, dated ranges, interim at
     W8-11, final at W22-23, and a caption saying the run is 23 weeks not 20
P0.4 Workshop 1 is TBC (~9 Nov), not asserted as 9 Nov
P0.5 the brief's stack is named: PyMuPDF, python-pptx, Streamlit, CodeBuddy
P0.6 disclosure says this document is also the basis of the AI report

Builders now write next to themselves instead of into a hard-coded path, so the
move to ~/Downloads cannot break them again.
</commit_message>
<xml_diff>
--- a/docs/Proposal_Background_and_Plan.docx
+++ b/docs/Proposal_Background_and_Plan.docx
@@ -118,7 +118,7 @@
           <w:i w:val="0"/>
           <w:sz w:val="21"/>
         </w:rPr>
-        <w:t>Generation. PPTAgent treats deck creation as editing rather than authoring: it analyses reference presentations, extracts slide-level schemas, and emits edit actions. SlideGen, SlideLab and ArcDeck add narrative planning and multimodal grounding. These systems produce convincing decks, and on blind preference tests they are competitive with commercial tools.</w:t>
+        <w:t>Generation. PPTAgent treats deck creation as editing rather than authoring: it analyses reference presentations, extracts slide-level schemas, and emits edit actions. SlideGen, SlideLab and ArcDeck add narrative planning and multimodal grounding. These systems produce convincing decks, and on blind preference tests they are competitive with commercial tools. X+Slides makes the audience an explicit conditioning input rather than a constant (Chen et al., 2026).</w:t>
       </w:r>
     </w:p>
     <w:p>
@@ -127,7 +127,7 @@
           <w:i w:val="0"/>
           <w:sz w:val="21"/>
         </w:rPr>
-        <w:t>Repair. ReDeck decomposes revision into atomic edit actions and returns a renderer-derived observation after each one. PPTPilot, introduced with PPTArena, runs a plan-edit-check loop in which a vision-language model judges the result. SLIDEFORGE keeps slides as structured artefacts so that edits preserve native editability.</w:t>
+        <w:t>Repair. ReDeck decomposes revision into atomic edit actions and returns a renderer-derived observation after each one. PPTPilot, introduced with PPTArena, runs a plan-edit-check loop in which a vision-language model judges the result. SLIDEFORGE keeps slides as structured artefacts so that edits preserve native editability. DeepPresenter extends the loop with environment-grounded reflection (Zheng et al., 2026a).</w:t>
       </w:r>
     </w:p>
     <w:p>
@@ -136,7 +136,7 @@
           <w:i w:val="0"/>
           <w:sz w:val="21"/>
         </w:rPr>
-        <w:t>Evaluation. SlideAudit (UIST '25) provides an expert taxonomy of 27 slide design flaws over 2,400 annotated slides. DECKBench (KDD '26) scores decks against reference decks with similarity metrics and an LLM judge. PresentBench scores generation with fine-grained rubrics.</w:t>
+        <w:t>Evaluation. SlideAudit (UIST '25) provides an expert taxonomy of 27 slide design flaws over 2,400 annotated slides. DECKBench (KDD '26) scores decks against reference decks with similarity metrics and an LLM judge. PresentBench scores generation with fine-grained rubrics. PPTBench asks a different question - whether a model understands layout and design at all (Huang et al., 2025).</w:t>
       </w:r>
     </w:p>
     <w:p>
@@ -486,7 +486,7 @@
           <w:i w:val="0"/>
           <w:sz w:val="21"/>
         </w:rPr>
-        <w:t>Three things are genuinely solved. Decks look convincing: layout is stable and styling consistent. Output is increasingly editable, because work has moved into the .pptx object layer. And evaluation has matured from holistic scores to task-based measures — answering questions using only the artefact, or gating readiness on explicit criteria.</w:t>
+        <w:t>Three things are genuinely solved. Decks look convincing: layout is stable and styling consistent. Output is increasingly editable, because work has moved into the .pptx object layer; PosterMELD shows the same shift for posters, emitting print-ready, editable artefacts (Hu et al., 2026). And evaluation has matured from holistic scores to task-based measures — answering questions using only the artefact, or gating readiness on explicit criteria.</w:t>
       </w:r>
     </w:p>
     <w:p>
@@ -1695,6 +1695,15 @@
           <w:i w:val="0"/>
           <w:sz w:val="21"/>
         </w:rPr>
+        <w:t>The stack follows the brief: PyMuPDF for parsing and figure extraction, python-pptx for native, editable output, a Streamlit front end for the demonstration, and CodeBuddy as the agent harness during development.</w:t>
+      </w:r>
+    </w:p>
+    <w:p>
+      <w:r>
+        <w:rPr>
+          <w:i w:val="0"/>
+          <w:sz w:val="21"/>
+        </w:rPr>
         <w:t>Two departures from the brief's suggested schedule are deliberate. The brief places inspection in stage 5, weeks 12 to 14; this project begins it in week 5, because the metric has to be validated before the loop that depends on it is built. Second, the brief's stage 6 comparison names accuracy, coverage, readability, design, latency and cost. Coverage — whether the paper's key claims survive into the deck — is measured explicitly, with five to eight claims annotated per paper, so that all six dimensions are reported.</w:t>
       </w:r>
     </w:p>
@@ -1709,7 +1718,7 @@
           <w:color w:val="5A6B7C"/>
           <w:sz w:val="17"/>
         </w:rPr>
-        <w:t>Table 4. Schedule against the University timeline.</w:t>
+        <w:t>Table 4. Schedule against the University timeline. Weeks are counted from 26 Oct 2026; the run to the final submission is 23 weeks, not the 20 in the brief's suggested plan.</w:t>
       </w:r>
     </w:p>
     <w:tbl>
@@ -1731,7 +1740,7 @@
         </w:trPr>
         <w:tc>
           <w:tcPr>
-            <w:tcW w:type="dxa" w:w="1304"/>
+            <w:tcW w:type="dxa" w:w="1984"/>
           </w:tcPr>
           <w:p>
             <w:pPr>
@@ -1749,7 +1758,7 @@
         </w:tc>
         <w:tc>
           <w:tcPr>
-            <w:tcW w:type="dxa" w:w="2438"/>
+            <w:tcW w:type="dxa" w:w="2098"/>
           </w:tcPr>
           <w:p>
             <w:pPr>
@@ -1767,7 +1776,7 @@
         </w:tc>
         <w:tc>
           <w:tcPr>
-            <w:tcW w:type="dxa" w:w="3515"/>
+            <w:tcW w:type="dxa" w:w="2948"/>
           </w:tcPr>
           <w:p>
             <w:pPr>
@@ -1785,7 +1794,7 @@
         </w:tc>
         <w:tc>
           <w:tcPr>
-            <w:tcW w:type="dxa" w:w="2494"/>
+            <w:tcW w:type="dxa" w:w="2268"/>
           </w:tcPr>
           <w:p>
             <w:pPr>
@@ -1808,7 +1817,7 @@
         </w:trPr>
         <w:tc>
           <w:tcPr>
-            <w:tcW w:type="dxa" w:w="1304"/>
+            <w:tcW w:type="dxa" w:w="1984"/>
           </w:tcPr>
           <w:p>
             <w:pPr>
@@ -1820,13 +1829,13 @@
               <w:rPr>
                 <w:sz w:val="17"/>
               </w:rPr>
-              <w:t>W1–2</w:t>
+              <w:t>W1–2  26 Oct – 8 Nov</w:t>
             </w:r>
           </w:p>
         </w:tc>
         <w:tc>
           <w:tcPr>
-            <w:tcW w:type="dxa" w:w="2438"/>
+            <w:tcW w:type="dxa" w:w="2098"/>
           </w:tcPr>
           <w:p>
             <w:pPr>
@@ -1844,7 +1853,7 @@
         </w:tc>
         <w:tc>
           <w:tcPr>
-            <w:tcW w:type="dxa" w:w="3515"/>
+            <w:tcW w:type="dxa" w:w="2948"/>
           </w:tcPr>
           <w:p>
             <w:pPr>
@@ -1862,7 +1871,7 @@
         </w:tc>
         <w:tc>
           <w:tcPr>
-            <w:tcW w:type="dxa" w:w="2494"/>
+            <w:tcW w:type="dxa" w:w="2268"/>
           </w:tcPr>
           <w:p>
             <w:pPr>
@@ -1885,7 +1894,7 @@
         </w:trPr>
         <w:tc>
           <w:tcPr>
-            <w:tcW w:type="dxa" w:w="1304"/>
+            <w:tcW w:type="dxa" w:w="1984"/>
           </w:tcPr>
           <w:p>
             <w:pPr>
@@ -1897,13 +1906,13 @@
               <w:rPr>
                 <w:sz w:val="17"/>
               </w:rPr>
-              <w:t>W3–4</w:t>
+              <w:t>W3–4  9 – 22 Nov</w:t>
             </w:r>
           </w:p>
         </w:tc>
         <w:tc>
           <w:tcPr>
-            <w:tcW w:type="dxa" w:w="2438"/>
+            <w:tcW w:type="dxa" w:w="2098"/>
           </w:tcPr>
           <w:p>
             <w:pPr>
@@ -1921,7 +1930,7 @@
         </w:tc>
         <w:tc>
           <w:tcPr>
-            <w:tcW w:type="dxa" w:w="3515"/>
+            <w:tcW w:type="dxa" w:w="2948"/>
           </w:tcPr>
           <w:p>
             <w:pPr>
@@ -1939,7 +1948,7 @@
         </w:tc>
         <w:tc>
           <w:tcPr>
-            <w:tcW w:type="dxa" w:w="2494"/>
+            <w:tcW w:type="dxa" w:w="2268"/>
           </w:tcPr>
           <w:p>
             <w:pPr>
@@ -1951,7 +1960,7 @@
               <w:rPr>
                 <w:sz w:val="17"/>
               </w:rPr>
-              <w:t>Workshop 1, 9 Nov</w:t>
+              <w:t>Workshop 1, TBC (≈9 Nov)</w:t>
             </w:r>
           </w:p>
         </w:tc>
@@ -1962,7 +1971,7 @@
         </w:trPr>
         <w:tc>
           <w:tcPr>
-            <w:tcW w:type="dxa" w:w="1304"/>
+            <w:tcW w:type="dxa" w:w="1984"/>
           </w:tcPr>
           <w:p>
             <w:pPr>
@@ -1974,13 +1983,13 @@
               <w:rPr>
                 <w:sz w:val="17"/>
               </w:rPr>
-              <w:t>W5–7</w:t>
+              <w:t>W5–7  23 Nov – 13 Dec</w:t>
             </w:r>
           </w:p>
         </w:tc>
         <w:tc>
           <w:tcPr>
-            <w:tcW w:type="dxa" w:w="2438"/>
+            <w:tcW w:type="dxa" w:w="2098"/>
           </w:tcPr>
           <w:p>
             <w:pPr>
@@ -1998,7 +2007,7 @@
         </w:tc>
         <w:tc>
           <w:tcPr>
-            <w:tcW w:type="dxa" w:w="3515"/>
+            <w:tcW w:type="dxa" w:w="2948"/>
           </w:tcPr>
           <w:p>
             <w:pPr>
@@ -2016,7 +2025,7 @@
         </w:tc>
         <w:tc>
           <w:tcPr>
-            <w:tcW w:type="dxa" w:w="2494"/>
+            <w:tcW w:type="dxa" w:w="2268"/>
           </w:tcPr>
           <w:p>
             <w:pPr>
@@ -2039,7 +2048,7 @@
         </w:trPr>
         <w:tc>
           <w:tcPr>
-            <w:tcW w:type="dxa" w:w="1304"/>
+            <w:tcW w:type="dxa" w:w="1984"/>
           </w:tcPr>
           <w:p>
             <w:pPr>
@@ -2051,13 +2060,13 @@
               <w:rPr>
                 <w:sz w:val="17"/>
               </w:rPr>
-              <w:t>W8–11</w:t>
+              <w:t>W8–11  14 Dec – 17 Jan</w:t>
             </w:r>
           </w:p>
         </w:tc>
         <w:tc>
           <w:tcPr>
-            <w:tcW w:type="dxa" w:w="2438"/>
+            <w:tcW w:type="dxa" w:w="2098"/>
           </w:tcPr>
           <w:p>
             <w:pPr>
@@ -2069,13 +2078,13 @@
               <w:rPr>
                 <w:sz w:val="17"/>
               </w:rPr>
-              <w:t>Layout and rendering</w:t>
+              <w:t>Layout and repair</w:t>
             </w:r>
           </w:p>
         </w:tc>
         <w:tc>
           <w:tcPr>
-            <w:tcW w:type="dxa" w:w="3515"/>
+            <w:tcW w:type="dxa" w:w="2948"/>
           </w:tcPr>
           <w:p>
             <w:pPr>
@@ -2093,7 +2102,84 @@
         </w:tc>
         <w:tc>
           <w:tcPr>
-            <w:tcW w:type="dxa" w:w="2494"/>
+            <w:tcW w:type="dxa" w:w="2268"/>
+          </w:tcPr>
+          <w:p>
+            <w:pPr>
+              <w:keepNext/>
+              <w:spacing w:after="20"/>
+            </w:pPr>
+            <w:r/>
+            <w:r>
+              <w:rPr>
+                <w:sz w:val="17"/>
+              </w:rPr>
+              <w:t>Interim report, 7 Jan 2027</w:t>
+            </w:r>
+          </w:p>
+        </w:tc>
+      </w:tr>
+      <w:tr>
+        <w:trPr>
+          <w:cantSplit/>
+        </w:trPr>
+        <w:tc>
+          <w:tcPr>
+            <w:tcW w:type="dxa" w:w="1984"/>
+          </w:tcPr>
+          <w:p>
+            <w:pPr>
+              <w:keepNext/>
+              <w:spacing w:after="20"/>
+            </w:pPr>
+            <w:r/>
+            <w:r>
+              <w:rPr>
+                <w:sz w:val="17"/>
+              </w:rPr>
+              <w:t>W12–14  18 Jan – 7 Feb</w:t>
+            </w:r>
+          </w:p>
+        </w:tc>
+        <w:tc>
+          <w:tcPr>
+            <w:tcW w:type="dxa" w:w="2098"/>
+          </w:tcPr>
+          <w:p>
+            <w:pPr>
+              <w:keepNext/>
+              <w:spacing w:after="20"/>
+            </w:pPr>
+            <w:r/>
+            <w:r>
+              <w:rPr>
+                <w:sz w:val="17"/>
+              </w:rPr>
+              <w:t>Calibration and loop</w:t>
+            </w:r>
+          </w:p>
+        </w:tc>
+        <w:tc>
+          <w:tcPr>
+            <w:tcW w:type="dxa" w:w="2948"/>
+          </w:tcPr>
+          <w:p>
+            <w:pPr>
+              <w:keepNext/>
+              <w:spacing w:after="20"/>
+            </w:pPr>
+            <w:r/>
+            <w:r>
+              <w:rPr>
+                <w:sz w:val="17"/>
+              </w:rPr>
+              <w:t>Sweeps frozen; loop converged</w:t>
+            </w:r>
+          </w:p>
+        </w:tc>
+        <w:tc>
+          <w:tcPr>
+            <w:tcW w:type="dxa" w:w="2268"/>
           </w:tcPr>
           <w:p>
             <w:pPr>
@@ -2116,7 +2202,7 @@
         </w:trPr>
         <w:tc>
           <w:tcPr>
-            <w:tcW w:type="dxa" w:w="1304"/>
+            <w:tcW w:type="dxa" w:w="1984"/>
           </w:tcPr>
           <w:p>
             <w:pPr>
@@ -2128,90 +2214,13 @@
               <w:rPr>
                 <w:sz w:val="17"/>
               </w:rPr>
-              <w:t>W12–14</w:t>
+              <w:t>W15–18  8 Feb – 7 Mar</w:t>
             </w:r>
           </w:p>
         </w:tc>
         <w:tc>
           <w:tcPr>
-            <w:tcW w:type="dxa" w:w="2438"/>
-          </w:tcPr>
-          <w:p>
-            <w:pPr>
-              <w:keepNext/>
-              <w:spacing w:after="20"/>
-            </w:pPr>
-            <w:r/>
-            <w:r>
-              <w:rPr>
-                <w:sz w:val="17"/>
-              </w:rPr>
-              <w:t>Calibration and loop</w:t>
-            </w:r>
-          </w:p>
-        </w:tc>
-        <w:tc>
-          <w:tcPr>
-            <w:tcW w:type="dxa" w:w="3515"/>
-          </w:tcPr>
-          <w:p>
-            <w:pPr>
-              <w:keepNext/>
-              <w:spacing w:after="20"/>
-            </w:pPr>
-            <w:r/>
-            <w:r>
-              <w:rPr>
-                <w:sz w:val="17"/>
-              </w:rPr>
-              <w:t>Sweeps frozen; loop converged</w:t>
-            </w:r>
-          </w:p>
-        </w:tc>
-        <w:tc>
-          <w:tcPr>
-            <w:tcW w:type="dxa" w:w="2494"/>
-          </w:tcPr>
-          <w:p>
-            <w:pPr>
-              <w:keepNext/>
-              <w:spacing w:after="20"/>
-            </w:pPr>
-            <w:r/>
-            <w:r>
-              <w:rPr>
-                <w:sz w:val="17"/>
-              </w:rPr>
-              <w:t>Interim report, 7 Jan 2027</w:t>
-            </w:r>
-          </w:p>
-        </w:tc>
-      </w:tr>
-      <w:tr>
-        <w:trPr>
-          <w:cantSplit/>
-        </w:trPr>
-        <w:tc>
-          <w:tcPr>
-            <w:tcW w:type="dxa" w:w="1304"/>
-          </w:tcPr>
-          <w:p>
-            <w:pPr>
-              <w:keepNext/>
-              <w:spacing w:after="20"/>
-            </w:pPr>
-            <w:r/>
-            <w:r>
-              <w:rPr>
-                <w:sz w:val="17"/>
-              </w:rPr>
-              <w:t>W15–18</w:t>
-            </w:r>
-          </w:p>
-        </w:tc>
-        <w:tc>
-          <w:tcPr>
-            <w:tcW w:type="dxa" w:w="2438"/>
+            <w:tcW w:type="dxa" w:w="2098"/>
           </w:tcPr>
           <w:p>
             <w:pPr>
@@ -2229,7 +2238,7 @@
         </w:tc>
         <w:tc>
           <w:tcPr>
-            <w:tcW w:type="dxa" w:w="3515"/>
+            <w:tcW w:type="dxa" w:w="2948"/>
           </w:tcPr>
           <w:p>
             <w:pPr>
@@ -2247,7 +2256,7 @@
         </w:tc>
         <w:tc>
           <w:tcPr>
-            <w:tcW w:type="dxa" w:w="2494"/>
+            <w:tcW w:type="dxa" w:w="2268"/>
           </w:tcPr>
           <w:p>
             <w:pPr>
@@ -2270,11 +2279,11 @@
         </w:trPr>
         <w:tc>
           <w:tcPr>
-            <w:tcW w:type="dxa" w:w="1304"/>
+            <w:tcW w:type="dxa" w:w="1984"/>
           </w:tcPr>
           <w:p>
             <w:pPr>
-              <w:keepNext w:val="0"/>
+              <w:keepNext/>
               <w:spacing w:after="20"/>
             </w:pPr>
             <w:r/>
@@ -2282,17 +2291,17 @@
               <w:rPr>
                 <w:sz w:val="17"/>
               </w:rPr>
-              <w:t>W19–20</w:t>
+              <w:t>W19–21  8 – 28 Mar</w:t>
             </w:r>
           </w:p>
         </w:tc>
         <w:tc>
           <w:tcPr>
-            <w:tcW w:type="dxa" w:w="2438"/>
+            <w:tcW w:type="dxa" w:w="2098"/>
           </w:tcPr>
           <w:p>
             <w:pPr>
-              <w:keepNext w:val="0"/>
+              <w:keepNext/>
               <w:spacing w:after="20"/>
             </w:pPr>
             <w:r/>
@@ -2306,7 +2315,48 @@
         </w:tc>
         <w:tc>
           <w:tcPr>
-            <w:tcW w:type="dxa" w:w="3515"/>
+            <w:tcW w:type="dxa" w:w="2948"/>
+          </w:tcPr>
+          <w:p>
+            <w:pPr>
+              <w:keepNext/>
+              <w:spacing w:after="20"/>
+            </w:pPr>
+            <w:r/>
+            <w:r>
+              <w:rPr>
+                <w:sz w:val="17"/>
+              </w:rPr>
+              <w:t>Report, demo, slide draft</w:t>
+            </w:r>
+          </w:p>
+        </w:tc>
+        <w:tc>
+          <w:tcPr>
+            <w:tcW w:type="dxa" w:w="2268"/>
+          </w:tcPr>
+          <w:p>
+            <w:pPr>
+              <w:keepNext/>
+              <w:spacing w:after="20"/>
+            </w:pPr>
+            <w:r/>
+            <w:r>
+              <w:rPr>
+                <w:sz w:val="17"/>
+              </w:rPr>
+              <w:t>Supervisor review</w:t>
+            </w:r>
+          </w:p>
+        </w:tc>
+      </w:tr>
+      <w:tr>
+        <w:trPr>
+          <w:cantSplit/>
+        </w:trPr>
+        <w:tc>
+          <w:tcPr>
+            <w:tcW w:type="dxa" w:w="1984"/>
           </w:tcPr>
           <w:p>
             <w:pPr>
@@ -2318,13 +2368,13 @@
               <w:rPr>
                 <w:sz w:val="17"/>
               </w:rPr>
-              <w:t>Report, demo, slides</w:t>
+              <w:t>W22–23  29 Mar – 8 Apr</w:t>
             </w:r>
           </w:p>
         </w:tc>
         <w:tc>
           <w:tcPr>
-            <w:tcW w:type="dxa" w:w="2494"/>
+            <w:tcW w:type="dxa" w:w="2098"/>
           </w:tcPr>
           <w:p>
             <w:pPr>
@@ -2336,7 +2386,43 @@
               <w:rPr>
                 <w:sz w:val="17"/>
               </w:rPr>
-              <w:t>Final, 8 Apr 2027; presentation 9–21 Apr</w:t>
+              <w:t>Finalisation</w:t>
+            </w:r>
+          </w:p>
+        </w:tc>
+        <w:tc>
+          <w:tcPr>
+            <w:tcW w:type="dxa" w:w="2948"/>
+          </w:tcPr>
+          <w:p>
+            <w:pPr>
+              <w:keepNext w:val="0"/>
+              <w:spacing w:after="20"/>
+            </w:pPr>
+            <w:r/>
+            <w:r>
+              <w:rPr>
+                <w:sz w:val="17"/>
+              </w:rPr>
+              <w:t>Final report, demo, slides</w:t>
+            </w:r>
+          </w:p>
+        </w:tc>
+        <w:tc>
+          <w:tcPr>
+            <w:tcW w:type="dxa" w:w="2268"/>
+          </w:tcPr>
+          <w:p>
+            <w:pPr>
+              <w:keepNext w:val="0"/>
+              <w:spacing w:after="20"/>
+            </w:pPr>
+            <w:r/>
+            <w:r>
+              <w:rPr>
+                <w:sz w:val="17"/>
+              </w:rPr>
+              <w:t>Final, 8 Apr 2027; presentations 9–21 Apr</w:t>
             </w:r>
           </w:p>
         </w:tc>
@@ -2367,7 +2453,7 @@
           <w:i w:val="0"/>
           <w:sz w:val="21"/>
         </w:rPr>
-        <w:t>Generative AI tools were used for drafting and for code generation. All design decisions, the metric definitions, the evaluation protocol, the annotation and the analysis are the author's. The tools used and the extent of their use are recorded in a log, submitted with the report in line with the University's student guide on the use of GenAI.</w:t>
+        <w:t>Generative AI tools were used for drafting and for code generation. All design decisions, the metric definitions, the evaluation protocol, the annotation and the analysis are the author's. The tools used and the extent of their use are recorded in a log, submitted with the report in line with the University's student guide on the use of GenAI. This document also forms the basis of the separate AI report submitted with the final report.</w:t>
       </w:r>
     </w:p>
     <w:p>
@@ -2407,6 +2493,19 @@
           <w:color w:val="10233A"/>
           <w:sz w:val="16"/>
         </w:rPr>
+        <w:t>Chen, X.-S., Zhu, J., Li, P.-L., Wang, H., &amp; Guo, M.-H. (2026). PresentBench: A fine-grained rubric-based benchmark for slide generation. arXiv:2603.07244.</w:t>
+      </w:r>
+    </w:p>
+    <w:p>
+      <w:pPr>
+        <w:spacing w:after="60"/>
+        <w:ind w:left="340" w:hanging="340"/>
+      </w:pPr>
+      <w:r>
+        <w:rPr>
+          <w:color w:val="10233A"/>
+          <w:sz w:val="16"/>
+        </w:rPr>
         <w:t>Hu, H., Dang, C., Liu, Y., et al. (2026). PosterMELD: Multi-agent paper-to-poster generation with editable print-ready outputs. arXiv:2608.02218.</w:t>
       </w:r>
     </w:p>
@@ -2434,6 +2533,19 @@
           <w:sz w:val="16"/>
         </w:rPr>
         <w:t>IEEE Nanotechnology Materials and Devices Conference. (2021). Presentation preparation guidelines and requirements. https://ieeenmdc.org/past-conferences/nmdc-2021/call-for-papers/presentation-preparation-guidelines-and-requirements/</w:t>
+      </w:r>
+    </w:p>
+    <w:p>
+      <w:pPr>
+        <w:spacing w:after="60"/>
+        <w:ind w:left="340" w:hanging="340"/>
+      </w:pPr>
+      <w:r>
+        <w:rPr>
+          <w:color w:val="10233A"/>
+          <w:sz w:val="16"/>
+        </w:rPr>
+        <w:t>Liang, X., Zhang, Z., Zhang, X., Su, H., Xu, Y., Sun, S., &amp; You, C. (2025). SlideGen: Collaborative multimodal agents for scientific slide generation. arXiv:2512.04529.</w:t>
       </w:r>
     </w:p>
     <w:p>

</xml_diff>